<commit_message>
Update feature docs for v0.3.3 (--version, airgap HF nuance, cloud limits)
</commit_message>
<xml_diff>
--- a/docs/pixo_features_detailed.docx
+++ b/docs/pixo_features_detailed.docx
@@ -29,7 +29,7 @@
           <w:i/>
           <w:color w:val="64748B"/>
         </w:rPr>
-        <w:t>Current version: v0.3.0</w:t>
+        <w:t>Current version: v0.3.3</w:t>
       </w:r>
     </w:p>
     <w:p>
@@ -760,6 +760,14 @@
       </w:pPr>
       <w:r>
         <w:t>Checks the input file exists.</w:t>
+      </w:r>
+    </w:p>
+    <w:p>
+      <w:pPr>
+        <w:pStyle w:val="ListBullet"/>
+      </w:pPr>
+      <w:r>
+        <w:t>Pre-flight checks: refuses incompatible combinations (e.g. video on cloud, sam2 on video, --airgap on a model that isn't pulled) with a clear suggestion.</w:t>
       </w:r>
     </w:p>
     <w:p>
@@ -1344,7 +1352,7 @@
         <w:pStyle w:val="ListBullet"/>
       </w:pPr>
       <w:r>
-        <w:t>Sets environment variables (HF_HUB_OFFLINE=1, TRANSFORMERS_OFFLINE=1, YOLO_OFFLINE=True) so libraries skip their connectivity checks.</w:t>
+        <w:t>Sets offline environment variables (HF_HUB_OFFLINE=1, TRANSFORMERS_OFFLINE=1, HF_DATASETS_OFFLINE=1, YOLO_OFFLINE=True) at process start, so HuggingFace and Ultralytics skip every connectivity check.</w:t>
       </w:r>
     </w:p>
     <w:p>
@@ -1368,12 +1376,49 @@
         <w:pStyle w:val="ListBullet"/>
       </w:pPr>
       <w:r>
-        <w:t>Reverts all patches when the run finishes — system network is untouched afterward.</w:t>
+        <w:t>Reverts all patches when the run finishes — your system network is untouched afterward.</w:t>
       </w:r>
     </w:p>
     <w:p>
       <w:r>
         <w:t>Only loopback (127.0.0.1) stays allowed, so local services keep working.</w:t>
+      </w:r>
+    </w:p>
+    <w:p>
+      <w:r>
+        <w:rPr>
+          <w:b/>
+        </w:rPr>
+        <w:t>Pre-flight refusals (so you never see ugly tracebacks)</w:t>
+      </w:r>
+    </w:p>
+    <w:p>
+      <w:r>
+        <w:t>Pixo checks a few things before entering the airgap context:</w:t>
+      </w:r>
+    </w:p>
+    <w:p>
+      <w:pPr>
+        <w:pStyle w:val="ListBullet"/>
+      </w:pPr>
+      <w:r>
+        <w:t>If the model's weights aren't pulled yet, --airgap is refused with a friendly message: "Run once without --airgap to fetch the weights, then re-run with --airgap."</w:t>
+      </w:r>
+    </w:p>
+    <w:p>
+      <w:pPr>
+        <w:pStyle w:val="ListBullet"/>
+      </w:pPr>
+      <w:r>
+        <w:t>If the model uses HuggingFace transformers (depth_anything_v2, grounding_dino, florence2, sam2, samurai) and the HuggingFace cache hasn't been populated yet, --airgap is refused with a similar suggestion. This catches the case where you have the .pt file but transformers also needs a processor/config from HF Hub.</w:t>
+      </w:r>
+    </w:p>
+    <w:p>
+      <w:pPr>
+        <w:pStyle w:val="ListBullet"/>
+      </w:pPr>
+      <w:r>
+        <w:t>--airgap cannot be combined with --backend kaggle or --backend colab — those need network by definition.</w:t>
       </w:r>
     </w:p>
     <w:p>
@@ -1396,20 +1441,7 @@
     </w:p>
     <w:p>
       <w:r>
-        <w:t>You'll see "Airgap: network access blocked for this run" in the output. If anything inside the run tries to dial out, it'll fail fast with a clear error telling you which host was blocked.</w:t>
-      </w:r>
-    </w:p>
-    <w:p>
-      <w:r>
-        <w:rPr>
-          <w:b/>
-        </w:rPr>
-        <w:t>Combines with</w:t>
-      </w:r>
-    </w:p>
-    <w:p>
-      <w:r>
-        <w:t>You cannot combine --airgap with --backend kaggle or --backend colab — those need network by definition. pixo will refuse with a clear error.</w:t>
+        <w:t>You'll see "Airgap: network access blocked for this run" in the output. If anything inside the run still tries to dial out, it fails fast with a clear error telling you which host was blocked.</w:t>
       </w:r>
     </w:p>
     <w:p>
@@ -1542,6 +1574,19 @@
       </w:r>
     </w:p>
     <w:p>
+      <w:r>
+        <w:rPr>
+          <w:b/>
+        </w:rPr>
+        <w:t>Works for every model and every backend</w:t>
+      </w:r>
+    </w:p>
+    <w:p>
+      <w:r>
+        <w:t>pixo share doesn't care which model produced the run — it just reads the standard output folder. So the same command works for a YOLO image run, a SAM2 segmentation, a Florence-2 caption, or a depth map. As of v0.3.2, cloud runs (Kaggle/Colab) are also tracked in history and can be exported with pixo share.</w:t>
+      </w:r>
+    </w:p>
+    <w:p>
       <w:pPr>
         <w:pBdr>
           <w:bottom w:val="single" w:sz="6" w:space="1" w:color="auto"/>
@@ -2458,6 +2503,24 @@
       </w:r>
     </w:p>
     <w:p>
+      <w:r>
+        <w:rPr>
+          <w:b/>
+        </w:rPr>
+        <w:t>v0.3 limitation: cloud is image-only</w:t>
+      </w:r>
+    </w:p>
+    <w:p>
+      <w:r>
+        <w:t>In v0.3, the Kaggle and Colab backends only support image inputs. If you try --backend kaggle on a video, pixo refuses pre-flight with a clear message and points you to local execution. Cloud video support is planned for v0.4.</w:t>
+      </w:r>
+    </w:p>
+    <w:p>
+      <w:r>
+        <w:t>Cloud runs are now tracked in pixo history (added in v0.3.2), so they show up in pixo history, can be opened with pixo view, and exported with pixo share like any local run.</w:t>
+      </w:r>
+    </w:p>
+    <w:p>
       <w:pPr>
         <w:pStyle w:val="Heading3"/>
       </w:pPr>
@@ -3468,6 +3531,39 @@
           <w:sz w:val="20"/>
         </w:rPr>
         <w:t>pixo rm sam2:tiny    # specific variant</w:t>
+      </w:r>
+    </w:p>
+    <w:p>
+      <w:pPr>
+        <w:pStyle w:val="Heading3"/>
+      </w:pPr>
+      <w:r>
+        <w:t>pixo --version  /  pixo -V</w:t>
+      </w:r>
+    </w:p>
+    <w:p>
+      <w:r>
+        <w:t>Print the installed pixo version and exit.</w:t>
+      </w:r>
+    </w:p>
+    <w:p>
+      <w:r>
+        <w:rPr>
+          <w:rFonts w:ascii="Consolas" w:hAnsi="Consolas"/>
+          <w:color w:val="0B5E07"/>
+          <w:sz w:val="20"/>
+        </w:rPr>
+        <w:t>pixo --version</w:t>
+      </w:r>
+    </w:p>
+    <w:p>
+      <w:r>
+        <w:rPr>
+          <w:rFonts w:ascii="Consolas" w:hAnsi="Consolas"/>
+          <w:color w:val="0B5E07"/>
+          <w:sz w:val="20"/>
+        </w:rPr>
+        <w:t>pixo -V</w:t>
       </w:r>
     </w:p>
     <w:p>
@@ -4348,7 +4444,7 @@
     </w:p>
     <w:p>
       <w:r>
-        <w:t>That's all of pixo v0.3.0. For the one-page summary, see pixo_features_summary.docx. For the strategic roadmap, see pixo_differentiation_roadmap.md. For what's planned next, see pixo_v0.3_todo.md.</w:t>
+        <w:t>That's all of pixo v0.3.3. For the one-page summary, see pixo_features_summary.docx. For the strategic roadmap, see pixo_differentiation_roadmap.md. For what's planned next, see pixo_v0.3_todo.md.</w:t>
       </w:r>
     </w:p>
     <w:sectPr>

</xml_diff>